<commit_message>
test(corpus): restart parity after page 1, one-line labels without widow control, and pinned values
</commit_message>
<xml_diff>
--- a/tests/corpus/word-rules/E-keepnext-break.docx
+++ b/tests/corpus/word-rules/E-keepnext-break.docx
@@ -4,10 +4,11 @@
   <w:body>
     <w:p>
       <w:pPr>
-        <w:spacing w:line="240" w:lineRule="exact"/>
-      </w:pPr>
-      <w:r>
-        <w:t xml:space="preserve">Case 01: 56 lines, then a paragraph kept with the next whose text holds a page break before its last 6 lines, then a paragraph of 3 lines kept together</w:t>
+        <w:widowControl w:val="0"/>
+        <w:spacing w:line="240" w:lineRule="exact"/>
+      </w:pPr>
+      <w:r>
+        <w:t xml:space="preserve">Case 01: 56 lines, then a paragraph with a page break, kept with the next</w:t>
         <w:br/>
         <w:t xml:space="preserve">filler line 2</w:t>
         <w:br/>
@@ -123,6 +124,7 @@
     <w:p>
       <w:pPr>
         <w:keepNext/>
+        <w:widowControl w:val="0"/>
         <w:spacing w:line="240" w:lineRule="exact"/>
       </w:pPr>
       <w:r>
@@ -148,6 +150,7 @@
     <w:p>
       <w:pPr>
         <w:keepLines/>
+        <w:widowControl w:val="0"/>
         <w:spacing w:line="240" w:lineRule="exact"/>
       </w:pPr>
       <w:r>
@@ -161,10 +164,11 @@
     <w:p>
       <w:pPr>
         <w:pageBreakBefore/>
-        <w:spacing w:line="240" w:lineRule="exact"/>
-      </w:pPr>
-      <w:r>
-        <w:t xml:space="preserve">Case 02: 20 lines, then a paragraph kept with the next whose text holds a page break before its last 56 lines, then a paragraph of 3 lines kept together</w:t>
+        <w:widowControl w:val="0"/>
+        <w:spacing w:line="240" w:lineRule="exact"/>
+      </w:pPr>
+      <w:r>
+        <w:t xml:space="preserve">Case 02: 20 lines, then a paragraph with a page break, kept with the next</w:t>
         <w:br/>
         <w:t xml:space="preserve">filler line 2</w:t>
         <w:br/>
@@ -208,6 +212,7 @@
     <w:p>
       <w:pPr>
         <w:keepNext/>
+        <w:widowControl w:val="0"/>
         <w:spacing w:line="240" w:lineRule="exact"/>
       </w:pPr>
       <w:r>
@@ -333,6 +338,7 @@
     <w:p>
       <w:pPr>
         <w:keepLines/>
+        <w:widowControl w:val="0"/>
         <w:spacing w:line="240" w:lineRule="exact"/>
       </w:pPr>
       <w:r>
@@ -346,10 +352,11 @@
     <w:p>
       <w:pPr>
         <w:pageBreakBefore/>
-        <w:spacing w:line="240" w:lineRule="exact"/>
-      </w:pPr>
-      <w:r>
-        <w:t xml:space="preserve">Case 03: 56 lines, then a heading kept with the next whose first run is a page break, then a paragraph of 3 lines kept together</w:t>
+        <w:widowControl w:val="0"/>
+        <w:spacing w:line="240" w:lineRule="exact"/>
+      </w:pPr>
+      <w:r>
+        <w:t xml:space="preserve">Case 03: 56 lines, then a heading after a page break, kept with the next</w:t>
         <w:br/>
         <w:t xml:space="preserve">filler line 2</w:t>
         <w:br/>
@@ -465,6 +472,7 @@
     <w:p>
       <w:pPr>
         <w:keepNext/>
+        <w:widowControl w:val="0"/>
         <w:spacing w:line="240" w:lineRule="exact"/>
       </w:pPr>
       <w:r>
@@ -477,6 +485,7 @@
     <w:p>
       <w:pPr>
         <w:keepLines/>
+        <w:widowControl w:val="0"/>
         <w:spacing w:line="240" w:lineRule="exact"/>
       </w:pPr>
       <w:r>

</xml_diff>